<commit_message>
Fix UTC quota-reset labeling, add error ref codes, wire up dashboard bell/feature-request, add Enterprise fair-use cap
</commit_message>
<xml_diff>
--- a/docs/product/2026-07-19-SHIJO-AI-Feature-Pricing-Review.docx
+++ b/docs/product/2026-07-19-SHIJO-AI-Feature-Pricing-Review.docx
@@ -1881,7 +1881,7 @@
         <w:spacing w:after="80"/>
       </w:pPr>
       <w:r>
-        <w:t xml:space="preserve">Generation limits: Free is 3/day, resets on a rolling daily clock. Pro/Enterprise are monthly (200 or unlimited). The daily counter for Free resets at UTC midnight — for anyone outside UTC that's a different clock time than their own local midnight, so the dashboard now shows a live countdown ("Resets in Xh Ym") instead of a flat "Resets at midnight," so it's accurate no matter where the visitor is.</w:t>
+        <w:t xml:space="preserve">Generation limits: Free is 3/day, resets on a rolling daily clock. Pro is 200/month. Enterprise is marketed and displayed as unlimited, and backed by a hidden fair-use ceiling for cost protection — see section 8. The daily counter for Free resets at UTC midnight — for anyone outside UTC that's a different clock time than their own local midnight, so the dashboard now shows a live countdown ("Resets in Xh Ym") instead of a flat "Resets at midnight," so it's accurate no matter where the visitor is.</w:t>
       </w:r>
     </w:p>
     <w:p>
@@ -2525,6 +2525,60 @@
       </w:pPr>
       <w:r>
         <w:t xml:space="preserve">Confirm whether the daily-quota reset should stay UTC-anchored (simplest, what's live now) or be converted to each user's local timezone (more accurate per-user, but requires storing a timezone on the account).</w:t>
+      </w:r>
+    </w:p>
+    <w:p>
+      <w:pPr>
+        <w:pStyle w:val="Heading1"/>
+        <w:spacing w:after="200" w:before="400"/>
+      </w:pPr>
+      <w:r>
+        <w:t xml:space="preserve">8. Enterprise "Unlimited" cost exposure — identified and fixed (added same day)</w:t>
+      </w:r>
+    </w:p>
+    <w:p>
+      <w:pPr>
+        <w:spacing w:after="150"/>
+      </w:pPr>
+      <w:r>
+        <w:t xml:space="preserve">You flagged a real gap after reviewing the billing page: the Enterprise plan promises "Unlimited generations," but every generation is a real, metered Anthropic API call — 9 of the 12 tools run on Sonnet ($3/$15 per million input/output tokens; Haiku tools are $1/$5). The code had zero enforcement on Enterprise: no cap, no throttle, allowed unconditionally.</w:t>
+      </w:r>
+    </w:p>
+    <w:p>
+      <w:pPr>
+        <w:spacing w:after="150"/>
+      </w:pPr>
+      <w:r>
+        <w:t xml:space="preserve">The math: worst case, a Sonnet generation costs about $0.03. At $99/month, the account's own revenue covers roughly 3,300 generations before the API cost exceeds what the customer paid — about 110/day, or under 5/hour running continuously. A single heavy or scripted account could blow past that with no ceiling in the code to stop it, and since Anthropic's rate limit is shared account-wide, one such user could also slow things down for every other customer on the platform, not just cost money.</w:t>
+      </w:r>
+    </w:p>
+    <w:p>
+      <w:pPr>
+        <w:spacing w:after="150"/>
+      </w:pPr>
+      <w:r>
+        <w:t xml:space="preserve">Fix shipped: a hidden fair-use ceiling (3,000 generations/month) now enforced server-side for Enterprise. It's deliberately invisible in the dashboard — genuinely heavy legitimate use never approaches it, so nothing changes for real customers, and the exact number isn't published (so it can't be gamed by probing for it). If it's ever hit, the response is a friendly "contact us to work out your usage volume" rather than a hard cutoff — this should be treated as a conversation with that customer, not an automated block.</w:t>
+      </w:r>
+    </w:p>
+    <w:p>
+      <w:pPr>
+        <w:spacing w:after="150"/>
+      </w:pPr>
+      <w:r>
+        <w:t xml:space="preserve">Also updated: the pricing copy on the landing page, the dashboard billing page, and the /lp variant all now say "Unlimited generations (fair use)" instead of a bare "Unlimited," plus a new Billing FAQ entry explaining what that means in plain terms. This keeps the marketing promise honest without publishing the internal ceiling.</w:t>
+      </w:r>
+    </w:p>
+    <w:p>
+      <w:pPr>
+        <w:pStyle w:val="ListParagraph"/>
+        <w:numPr>
+          <w:ilvl w:val="0"/>
+          <w:numId w:val="1"/>
+        </w:numPr>
+        <w:spacing w:after="80"/>
+      </w:pPr>
+      <w:r>
+        <w:t xml:space="preserve">Not done yet, optional: a per-minute/burst rate limit across all plans (Free/Pro/Enterprise) to stop scripted abuse regardless of monthly total — there's already an unused rate_limits table in the schema, provisioned but never wired up, which would be the natural place to implement this if you want it.</w:t>
       </w:r>
     </w:p>
     <w:sectPr>

</xml_diff>